<commit_message>
PM_23: full academic register rewrite + corrected 6-day dataset (Apr 28 - May 3). Spend €982 / 258 leads / CPL €3.81 / CTR 1.98%. Both reports zero em-dashes, zero prohibited words.
</commit_message>
<xml_diff>
--- a/deliverables/PM_23/output/PM_23_Leveling_Up_Report.docx
+++ b/deliverables/PM_23/output/PM_23_Leveling_Up_Report.docx
@@ -36,12 +36,12 @@
     </w:p>
     <w:p>
       <w:r>
-        <w:t>This report sits alongside my Marketing Report and my Sales Report for PM_23. The brief is the optional leveling-up document that the module description allows: a summary of achievements and contributions that meet or exceed Level 2 or Level 3 expertise, written to academic standards, capped at 3,000 words. I have organised the report around three claims, each of which I support with evidence drawn from the project work for Mango Lab → Still and from the wider Berlin SMB ecosystem I am operating in.</w:t>
+        <w:t>This report accompanies the Marketing Report and the Sales Report submitted for PM_23. The brief is the optional leveling-up document that the module description permits: a summary of achievements and contributions which meet or exceed the requirements for Level 2 or Level 3 expertise, written to academic standards, and limited to a cumulative 3,000 words. The argument is organised around three claims, each supported by evidence drawn from the project work for Mango Lab – Still and from the wider Berlin SMB ecosystem in which the venture operates.</w:t>
       </w:r>
     </w:p>
     <w:p>
       <w:r>
-        <w:t>The three claims are: first, that I have applied marketing methodology to a real, live B2B SaaS project at a level of operational depth that meets the Level 3 bar (not just describing methods, but selecting between them and reflecting on the trade-offs). Second, that I have validated the underlying business model through a combination of warm outreach, an agency wedge, and a paid plus organic acquisition sprint that produced measurable revenue and measurable acquisition cost. Third, that I have begun making community contributions outside the classroom (a building-in-public LinkedIn cadence, working with two paying clients, and the Mango Lab content that other founders are now referencing) that extend the work beyond the assessment artefact.</w:t>
+        <w:t>The three claims are as follows. First, that the marketing methodology applied to the project demonstrates a level of operational depth consistent with the Level 3 standard, in that the work selects between competing methods rather than describing them in isolation. Second, that the underlying business model has been validated through a combination of warm outreach, an agency wedge, and the paid and organic acquisition sprint reported in the Marketing Report, the latter producing measurable acquisition cost data that exceed published industry benchmarks. Third, that community contributions have been initiated outside the assessment context, including a building-in-public LinkedIn cadence, two paying client engagements, and the Mango Lab content currently being referenced by other founders.</w:t>
       </w:r>
     </w:p>
     <w:p>
@@ -54,7 +54,7 @@
     </w:p>
     <w:p>
       <w:r>
-        <w:t>Level 3 in the CODE level descriptions asks for the application of frameworks rather than the description of them. The Marketing Report I am submitting alongside this document covers the application in detail. What I want to do here is name the deliberate choices I made between competing methods, because choosing is the part that distinguishes Level 2 from Level 3.</w:t>
+        <w:t>Level 3 in the CODE level descriptions requires the application of frameworks rather than the description of them. The Marketing Report submitted alongside this document covers the application in detail. The purpose of this section is to identify the deliberate methodological choices that distinguish the Level 3 standard of application from the Level 2 standard of description.</w:t>
       </w:r>
     </w:p>
     <w:p>
@@ -62,17 +62,17 @@
         <w:pStyle w:val="Heading2"/>
       </w:pPr>
       <w:r>
-        <w:t>Choosing the lean loop over the waterfall plan</w:t>
+        <w:t>Selecting the lean loop over the locked media plan</w:t>
       </w:r>
     </w:p>
     <w:p>
       <w:r>
-        <w:t>When I first scoped ENGINE_001, the natural temptation was to write a 14-day media plan, lock the creative, and execute. That is the plan style most marketing courses teach (Chaffey and Ellis-Chadwick, 2019). I deliberately rejected it in favour of Ries’s (2011) build-measure-learn loop, structured as a two-phase sprint: a learning phase (days 1 to 3) that ran four creative variants in parallel and a scale phase (days 4 to 14) that turned off the losers and concentrated budget on the winner. The methodological reason is that, at €400 of spend, a locked plan cannot recover from a wrong assumption. The lean loop can. Ries (2011) makes this point bluntly: ‘the only way to win is to learn faster than anyone else’ (p. 111).</w:t>
+        <w:t>When ENGINE_001 was scoped, the conventional approach available was a 14-day locked media plan with fixed creative and a single-shot budget allocation. This is the planning style most commonly taught in digital marketing texts (Chaffey and Ellis-Chadwick, 2019). The lean startup build-measure-learn loop (Ries, 2011) was selected in preference to it. The methodological reasoning is that, at a budget scale of €400 to €1,000, a locked plan cannot recover from a wrong assumption, whereas a learning-then-scale loop can. Ries (2011, p. 111) makes the point in stronger terms: ‘the only way to win is to learn faster than anyone else’.</w:t>
       </w:r>
     </w:p>
     <w:p>
       <w:r>
-        <w:t>The decision paid off concretely. The variant I expected to win (the dashboard-led ad) lost, and the variant I had thought of as the soft option (the founder voiceover) won by a factor of two on cost per lead. A locked plan would have spent €400 on the wrong creative. The loop spent €230 on the wrong creative and is positioned to spend €170 on the right one. That is a Level 3 use of the framework, not a Level 1 description of it.</w:t>
+        <w:t>The decision produced a measurable consequence. The creative variant that the author had expected to win (the dashboard-led ‘New Leads Ad’) underperformed by a factor of three to four against the brand-led ‘Copy 3’ variant, which returned a cost per lead of €2.81 against the original variant’s €10.00. A locked plan would have allocated the full budget to the wrong creative. The lean loop allocated the learning-phase budget across eight executions and is positioned to allocate the scale-phase budget to the variant that the data identified. This sequence constitutes a Level 3 application of the framework rather than a Level 1 description of it.</w:t>
       </w:r>
     </w:p>
     <w:p>
@@ -80,12 +80,12 @@
         <w:pStyle w:val="Heading2"/>
       </w:pPr>
       <w:r>
-        <w:t>Choosing dual-channel over single-channel</w:t>
+        <w:t>Selecting dual-channel over single-channel</w:t>
       </w:r>
     </w:p>
     <w:p>
       <w:r>
-        <w:t>The second deliberate choice was to run paid and organic in parallel. A single-channel sprint would have been easier to measure and easier to defend in a write-up. The reason I chose the harder option is grounded in two pieces of literature. Lemon and Verhoef (2016) describe the customer journey as ‘accumulated experiences across touchpoints over time’ (p. 78), and Edelman’s (2024) B2B trust report shows that B2B buyers do roughly 70 percent of their decision work before they identify themselves to a vendor. A paid lead form captures the visible 30 percent. Organic content is what builds the invisible 70 percent. Running both in parallel gives me data on the visible part and a leading indicator of the invisible part. The 27,218 organic views across the sprint window are not lead-form fills, but they are the second touchpoint that the literature predicts I will see show up in conversion lag time over the following weeks.</w:t>
+        <w:t>The second methodological choice was to run paid and organic channels in parallel rather than sequentially. A single-channel sprint would have been simpler to measure and to report. Two pieces of literature support the dual-channel approach. Lemon and Verhoef (2016, p. 78) describe the customer journey as ‘accumulated experiences across touchpoints over time’, and the Edelman (2024) B2B trust report shows that B2B buyers complete approximately 70 percent of their decision time on independent research before identifying themselves to a vendor. A paid lead form captures the visible 30 percent. Organic content addresses the invisible 70 percent. Running both in parallel produces measurable data on the visible component and a leading indicator of the invisible component. The 27,218 organic views recorded across the sprint window do not constitute lead-form fills, but they do constitute the second touchpoint that the consumer behaviour literature predicts will materialise as conversion lag-time over subsequent weeks.</w:t>
       </w:r>
     </w:p>
     <w:p>
@@ -93,12 +93,12 @@
         <w:pStyle w:val="Heading2"/>
       </w:pPr>
       <w:r>
-        <w:t>Choosing the Mom Test over the demo script for qualification</w:t>
+        <w:t>Selecting the Mom Test over the demo script for qualification</w:t>
       </w:r>
     </w:p>
     <w:p>
       <w:r>
-        <w:t>Every booked call from ENGINE_001 was qualified through a Fitzpatrick (2013) Mom Test interview rather than a product demo. The Mom Test asks the buyer about their current situation, their current cost of inaction, and the workaround they have built. The demo script asks the buyer to react to the product. The Mom Test is harder to run and feels slower in the moment, but it produces qualification data that survives the call (because it is about the buyer’s reality, not their reaction). I chose it because the cost of a false positive at this stage of Still is higher than the cost of a slower call. The qualification slide in the Sales Report (BANT plus a 30-second pain articulation test) is built to enforce that habit on whoever runs the call after me.</w:t>
+        <w:t>Every booked call originating from ENGINE_001 was qualified through a Fitzpatrick (2013) Mom Test interview rather than a product demonstration. The Mom Test asks the buyer about their current situation, their current cost of inaction, and the workaround they have constructed. The demo script asks the buyer to react to the product. The Mom Test is methodologically more demanding to administer and produces slower calls in the moment, but it returns qualification data that survives the call (because the data describes the buyer’s reality rather than their reaction). It was selected because the cost of a false positive at this stage of Still is higher than the cost of a slower call. The qualification slide in the Sales Report (BANT plus a 30-second pain articulation test) operationalises this choice for any future sales operator.</w:t>
       </w:r>
     </w:p>
     <w:p>
@@ -106,12 +106,12 @@
         <w:pStyle w:val="Heading1"/>
       </w:pPr>
       <w:r>
-        <w:t>Claim 2. Validation, not just instrumentation</w:t>
+        <w:t>Claim 2. Validation rather than instrumentation alone</w:t>
       </w:r>
     </w:p>
     <w:p>
       <w:r>
-        <w:t>A common trap in marketing modules is to confuse running a campaign with validating a business. ENGINE_001 produces both kinds of evidence. I want to separate them clearly here because the leveling-up bar asks for achievements, and a measured CPL is an instrumentation result, while a paying customer is a validation result.</w:t>
+        <w:t>A common pitfall in marketing modules is the conflation of running a campaign with validating a business. ENGINE_001 produces both kinds of evidence. The two are separated here because the leveling-up bar specifies achievements, and a measured cost per lead is an instrumentation result, while a paying customer is a validation result.</w:t>
       </w:r>
     </w:p>
     <w:p>
@@ -124,7 +124,7 @@
     </w:p>
     <w:p>
       <w:r>
-        <w:t>The Marketing Report covers the numbers in detail. In summary: 39,084 impressions, 696 link clicks, 72 leads, €5.36 cost per lead, 1.78 percent click-through rate. All three of CTR, CPC, and CPL came in significantly better than the published WordStream B2B Facebook benchmarks (LocaliQ, 2024). That is an instrumentation success. The campaign was technically well executed and the unit economics, at face value, support a viable acquisition channel.</w:t>
+        <w:t>The Marketing Report covers the numbers in detail. In summary: across a six-day window, the campaign generated 89,772 impressions, 1,776 link clicks, and 258 leads at a cost per lead of €3.81 and a click-through rate of 1.98 percent. All three of click-through rate, cost per click, and cost per lead exceeded the published WordStream B2B Facebook benchmarks (LocaliQ, 2024) by significant margins. This constitutes an instrumentation success: the campaign was technically well executed and the unit economics, at face value, support a viable acquisition channel.</w:t>
       </w:r>
     </w:p>
     <w:p>
@@ -137,7 +137,7 @@
     </w:p>
     <w:p>
       <w:r>
-        <w:t>The validation result is separate and stronger. Mango Lab → Still currently has two paying customers acquired through a combination of warm outreach and the agency wedge that preceded ENGINE_001: meetDWIGHT, an SMB tools company in Berlin, and a Berlin-based marketing agency. Both are paying for Still or for the agency-led implementation of Still. The combined monthly revenue is small (Still is in its first quarter of revenue) but the existence of two unrelated paying customers, in two different ICP slices, with different paths to closing, is the strongest signal of validity I have. It satisfies the YC heuristic that Graham (2012) calls ‘do things that don’t scale’: both customers were closed by hand, both received a non-scaled implementation, and both renewed. The point of running ENGINE_001 in parallel was to test whether the same value proposition that closed those two customers warm could also acquire cold leads at a viable cost. Three days of paid data say yes, with the qualifications I noted in the Marketing Report.</w:t>
+        <w:t>The validation result is separate and stronger. Mango Lab – Still currently has two paying customers acquired through a combination of warm outreach and the agency wedge that preceded ENGINE_001: meetDWIGHT, an SMB tools company in Berlin, and a Berlin-based marketing agency. Both parties are paying for either Still or for the agency-led implementation of Still. Combined monthly revenue is small (Still is in its first quarter of revenue) but the existence of two unrelated paying customers in two different ICP slices, with different paths to closing, constitutes the strongest single signal of validity available at this stage. The result is consistent with the Y Combinator heuristic that Graham (2012) terms ‘doing things that don’t scale’: both customers were closed by hand, both received a non-scaled implementation, and both have renewed. The role of ENGINE_001 was to test whether the same value proposition that closed those two customers warm could also acquire cold leads at a viable cost. The six-day paid dataset answers that question affirmatively, subject to the qualifications recorded in the Marketing Report.</w:t>
       </w:r>
     </w:p>
     <w:p>
@@ -145,12 +145,12 @@
         <w:pStyle w:val="Heading2"/>
       </w:pPr>
       <w:r>
-        <w:t>The validation gap I am honest about</w:t>
+        <w:t>The validation gap reported in the interest of analytical honesty</w:t>
       </w:r>
     </w:p>
     <w:p>
       <w:r>
-        <w:t>What ENGINE_001 has not yet done is convert any of the 72 leads into a paying customer. Every one of those leads is in flight, and the average sales cycle for an SMB SaaS product in Europe is 30 to 60 days (Pacific Crest SaaS Survey, 2024). I will not have a paid-channel-to-revenue number for at least another month. The honest framing is that the validation result is supported by the warm channel today and is being tested by the paid channel now. Both pieces of evidence are needed to claim Level 3.</w:t>
+        <w:t>ENGINE_001 has not yet converted any of the 258 leads into a paying customer at the time of writing. Each lead is in flight and the average sales cycle for an SMB SaaS product in Europe is reported at 30 to 60 days (Pacific Crest, 2024). A paid-channel-to-revenue figure will accordingly not be available for at least another month. The defensible framing is that the validation result is supported by the warm channel today and is being tested by the paid channel now, with both pieces of evidence required to support the Level 3 claim.</w:t>
       </w:r>
     </w:p>
     <w:p>
@@ -163,7 +163,7 @@
     </w:p>
     <w:p>
       <w:r>
-        <w:t>The leveling-up brief asks for community contribution as well as personal achievement. Here are the three concrete contributions I can document.</w:t>
+        <w:t>The leveling-up brief asks for community contribution alongside personal achievement. Three contributions are documented below.</w:t>
       </w:r>
     </w:p>
     <w:p>
@@ -176,7 +176,7 @@
     </w:p>
     <w:p>
       <w:r>
-        <w:t>I have been documenting the Mango Lab build on LinkedIn since the start of this semester. The 14-day v3 outreach sprint that preceded ENGINE_001 was posted as a daily build-in-public log, which other CODE students and Berlin SMB founders have referenced privately. The Notion Content OS that produced the 9 organic videos is itself open to other founders in the Berlin scene who are running personal-brand experiments, and three of them have copied the template into their own setups. Pulizzi (2014) calls this the long game of content marketing: build for an audience first, sell into it second. The contribution here is the public log of mistakes, not the product.</w:t>
+        <w:t>The Mango Lab build has been documented publicly on LinkedIn since the start of the semester. The 14-day v3 outreach sprint that preceded ENGINE_001 was published as a daily build-in-public log, which other CODE students and Berlin SMB founders have subsequently referenced. The Notion Content Operating System that produced the nine organic videos has been shared with three Berlin-based founders running personal-brand experiments, who have copied the template into their own setups. Pulizzi (2014) describes this pattern as the long game of content marketing: build for an audience first, sell into it second. The contribution consists of the public log of decisions and mistakes, not the product itself.</w:t>
       </w:r>
     </w:p>
     <w:p>
@@ -189,7 +189,7 @@
     </w:p>
     <w:p>
       <w:r>
-        <w:t>The two paying customers (meetDWIGHT and the agency) are not just revenue, they are also a feedback loop into the product. Both have been part of the discovery work that fed into PM_22, both have been quoted in the Mango Lab pitch deck, and both have introduced Still to other founders in their network. That second-order acquisition is the main mechanism through which an SMB SaaS product grows in its first year (Murphy, 2018). The community contribution is that those two customers are now on the public reference list for the product.</w:t>
+        <w:t>The two paying customers (meetDWIGHT and the Berlin agency) function not only as revenue but as a feedback loop into the product. Both have participated in the discovery work that fed PM_22, both are quoted in the Mango Lab pitch deck, and both have introduced Still to other founders within their networks. Murphy (2018) identifies this second-order acquisition as the dominant mechanism by which an SMB SaaS product grows during its first year. The community contribution consists of the public reference status these two customers now occupy.</w:t>
       </w:r>
     </w:p>
     <w:p>
@@ -202,7 +202,7 @@
     </w:p>
     <w:p>
       <w:r>
-        <w:t>The wider Mango Lab pattern (use an agency to fund SaaS development, then convert agency clients into SaaS users) is one I have written about and been asked to share with two other CODE founders in adjacent cohorts. It is not a novel pattern (Wessel, 2017, has documented several B2B agency-to-SaaS transitions), but the specific Berlin-SMB instantiation is the one I have lived in for two semesters and the one I can speak to with first-hand evidence. The contribution is in being a credible source for that pattern inside the CODE community, and in offering office hours to the two founders who have asked.</w:t>
+        <w:t>The wider Mango Lab pattern (an agency engagement is used to fund SaaS development, after which agency clients are converted into SaaS users) has been documented in the public-facing log and shared with two other CODE founders in adjacent cohorts. The pattern is not novel; Wessel (2017) has documented several B2B agency-to-SaaS transitions. The specific Berlin SMB instantiation, by contrast, is the one in which the author has direct first-hand experience across two semesters and is the version that can be spoken to credibly inside the CODE community. Office hours have been offered to the two founders concerned.</w:t>
       </w:r>
     </w:p>
     <w:p>
@@ -210,17 +210,22 @@
         <w:pStyle w:val="Heading1"/>
       </w:pPr>
       <w:r>
-        <w:t>Reflection on what the leveling-up frame asks of me</w:t>
+        <w:t>Reflection</w:t>
       </w:r>
     </w:p>
     <w:p>
       <w:r>
-        <w:t>The leveling-up bar is, in my reading, an invitation to be precise about what is mine and what is borrowed. The frameworks (lean, AARRR, YC, Mom Test, jobs-to-be-done) are borrowed and well documented. The campaign decisions, the creative direction, the budget allocation, the dual-channel structure, and the qualification model are mine. The two paying customers and the agency wedge are mine. The 9 organic videos and the Notion Content OS are mine. The benchmark comparison and the academic framing are borrowed; I have tried to cite them honestly.</w:t>
+        <w:t>Per the convention in reflective academic writing on the practitioner’s own work (Gibbs, 1988; Schon, 1983), this section is written in the first person.</w:t>
       </w:r>
     </w:p>
     <w:p>
       <w:r>
-        <w:t>If I had to pick one thing that distinguishes a Level 3 application of marketing from a Level 2 description of it, it would be the willingness to publish a number that could embarrass me. ENGINE_001’s tracking gap on the LandingPageView event is exactly that kind of number. A Level 2 report would either omit it or smooth over it. Section 14 of the Marketing Report names it, explains the cause, and lists the fix. That is the bar I am holding myself to.</w:t>
+        <w:t>The leveling-up bar reads, in my interpretation, as an invitation to be precise about what is mine and what is borrowed. The frameworks (lean, AARRR, Y Combinator, Mom Test, jobs-to-be-done) are borrowed and well documented in the literature. The campaign decisions, the creative direction, the budget allocation, the dual-channel structure, and the qualification model are mine. The two paying customers and the agency wedge are mine. The nine organic videos and the Notion Content Operating System are mine. The benchmark comparisons and the academic framing are borrowed and have been cited honestly.</w:t>
+      </w:r>
+    </w:p>
+    <w:p>
+      <w:r>
+        <w:t>If a single criterion separates a Level 3 application of marketing from a Level 2 description of it, in my view it is the willingness to publish a number that could embarrass the author. The LandingPageView tracking gap reported in section 14.5 of the Marketing Report is precisely such a number. A Level 2 report would either omit it or smooth it over. The Marketing Report names it, explains the cause, and lists the remediation. That is the standard against which I have tried to hold this submission.</w:t>
       </w:r>
     </w:p>
     <w:p>
@@ -233,7 +238,7 @@
     </w:p>
     <w:p>
       <w:r>
-        <w:t>Generative AI tools (Claude by Anthropic) were used as a research and drafting assistant in producing this report. The frameworks, the choices between them, the campaign decisions, the customer relationships, the Notion Content OS, the LinkedIn cadence, and the qualitative reflections are mine. Every cited reference has been read by me; I did not include any source I could not personally verify.</w:t>
+        <w:t>Generative AI tools (Claude by Anthropic) were used as a research and drafting assistant in producing this report. The frameworks, the choices between them, the campaign decisions, the customer relationships, the Notion Content Operating System, the LinkedIn cadence, and the qualitative reflections are the author’s own. Every cited reference has been read by the author, and no source has been included that could not be personally verified.</w:t>
       </w:r>
     </w:p>
     <w:p>
@@ -278,6 +283,18 @@
           <w:sz w:val="20"/>
         </w:rPr>
         <w:t>Fitzpatrick, R. (2013) The Mom Test: how to talk to customers and learn if your business is a good idea when everyone is lying to you. London: Founder Centric.</w:t>
+      </w:r>
+    </w:p>
+    <w:p>
+      <w:pPr>
+        <w:spacing w:after="80"/>
+        <w:ind w:left="567" w:hanging="567"/>
+      </w:pPr>
+      <w:r>
+        <w:rPr>
+          <w:sz w:val="20"/>
+        </w:rPr>
+        <w:t>Gibbs, G. (1988) Learning by doing: a guide to teaching and learning methods. London: Further Education Unit.</w:t>
       </w:r>
     </w:p>
     <w:p>
@@ -362,6 +379,18 @@
           <w:sz w:val="20"/>
         </w:rPr>
         <w:t>Ries, E. (2011) The lean startup: how today’s entrepreneurs use continuous innovation to create radically successful businesses. New York: Crown Business.</w:t>
+      </w:r>
+    </w:p>
+    <w:p>
+      <w:pPr>
+        <w:spacing w:after="80"/>
+        <w:ind w:left="567" w:hanging="567"/>
+      </w:pPr>
+      <w:r>
+        <w:rPr>
+          <w:sz w:val="20"/>
+        </w:rPr>
+        <w:t>Schon, D. A. (1983) The reflective practitioner: how professionals think in action. New York: Basic Books.</w:t>
       </w:r>
     </w:p>
     <w:p>

</xml_diff>

<commit_message>
PM_23: rewrite with verified Ads Manager + Lovable data (€250.80/45 leads/CPL €5.57, in-flight)
The earlier xlsx parse over-counted (€982 / 258 leads). Replaced with
screenshot-verified Ads Manager UI numbers as of 2026-05-03 10:09:
- Spend €250.80 of €400 (campaign still running, daily €50 cap not binding)
- 22,695 impressions / 10,472 unique reach / 45 form leads / CPL €5.57
- Per-ad CPL ranges €2.66 (Copy 3 b) to €15.06 (original Ad)
- Demographics: 73% male / 24% female; 53% of leads in 25-44 cohort
- Daily lead curve verified from performance overview chart

Added Lovable site analytics (30-day window): 257 unique visitors,
95% bounce rate, 119 Meta-attributed visits — landing-page bottleneck
named in §14.5 with concrete remediation in §16.

Marketing Report: 5,757 words, 9 visuals, all numbers traceable.
Leveling-up Report: 2,133 words, all numbers reconciled.
Dashboard PM_23 fields updated to in-flight framing.
</commit_message>
<xml_diff>
--- a/deliverables/PM_23/output/PM_23_Leveling_Up_Report.docx
+++ b/deliverables/PM_23/output/PM_23_Leveling_Up_Report.docx
@@ -72,7 +72,7 @@
     </w:p>
     <w:p>
       <w:r>
-        <w:t>The decision produced a measurable consequence. The creative variant that the author had expected to win (the dashboard-led ‘New Leads Ad’) underperformed by a factor of three to four against the brand-led ‘Copy 3’ variant, which returned a cost per lead of €2.81 against the original variant’s €10.00. A locked plan would have allocated the full budget to the wrong creative. The lean loop allocated the learning-phase budget across eight executions and is positioned to allocate the scale-phase budget to the variant that the data identified. This sequence constitutes a Level 3 application of the framework rather than a Level 1 description of it.</w:t>
+        <w:t>The decision produced a measurable consequence. The creative variant that the author had expected to win (the dashboard-led original ‘New Leads Ad’ in the Pillar D premium-product family) underperformed against the brand-led ‘Copy 3’ variants by a factor of approximately five. The original variant returned a cost per lead of €15.06 across three leads on €45.18 of spend, narrowly above the internal €15 target. The best brand-led execution returned €2.66 per lead. A locked plan would have allocated the full budget to the wrong creative. The lean loop allocated the learning-phase budget across eight executions and is positioned to allocate the scale-phase budget to the variants that the data identified. This sequence constitutes a Level 3 application of the framework rather than a Level 1 description of it.</w:t>
       </w:r>
     </w:p>
     <w:p>
@@ -124,7 +124,7 @@
     </w:p>
     <w:p>
       <w:r>
-        <w:t>The Marketing Report covers the numbers in detail. In summary: across a six-day window, the campaign generated 89,772 impressions, 1,776 link clicks, and 258 leads at a cost per lead of €3.81 and a click-through rate of 1.98 percent. All three of click-through rate, cost per click, and cost per lead exceeded the published WordStream B2B Facebook benchmarks (LocaliQ, 2024) by significant margins. This constitutes an instrumentation success: the campaign was technically well executed and the unit economics, at face value, support a viable acquisition channel.</w:t>
+        <w:t>The Marketing Report covers the numbers in detail. In summary, across the first six days of the in-flight window, the campaign has spent €250.80 of the €400 approved budget, generated 22,695 impressions reaching 10,472 unique Meta accounts, and produced 45 leads at a blended cost per lead of €5.57. The cost per lead is approximately 5.2 times below the published WordStream B2B Facebook benchmark of €29 (LocaliQ, 2024) and well below the median DACH B2B SaaS cost per lead reported by HubSpot (2024). The first-party site analytics (Lovable) record 257 unique visitors across the 30-day window with 119 visits attributable to Meta sources. This constitutes an instrumentation success: the campaign is technically well executed and the unit economics, at face value, support a viable acquisition channel.</w:t>
       </w:r>
     </w:p>
     <w:p>
@@ -150,7 +150,7 @@
     </w:p>
     <w:p>
       <w:r>
-        <w:t>ENGINE_001 has not yet converted any of the 258 leads into a paying customer at the time of writing. Each lead is in flight and the average sales cycle for an SMB SaaS product in Europe is reported at 30 to 60 days (Pacific Crest, 2024). A paid-channel-to-revenue figure will accordingly not be available for at least another month. The defensible framing is that the validation result is supported by the warm channel today and is being tested by the paid channel now, with both pieces of evidence required to support the Level 3 claim.</w:t>
+        <w:t>ENGINE_001 has not yet converted any of the 45 leads into a paying customer at the time of writing. Each lead is in flight and the average sales cycle for an SMB SaaS product in Europe is reported at 30 to 60 days (Pacific Crest, 2024). A paid-channel-to-revenue figure will accordingly not be available for at least another month. The defensible framing is that the validation result is supported by the warm channel today and is being tested by the paid channel now, with both pieces of evidence required to support the Level 3 claim.</w:t>
       </w:r>
     </w:p>
     <w:p>

</xml_diff>